<commit_message>
Grade 1 coverage matrix: statuses and gaps in goals tracker and plan
Co-Authored-By: Claude Sonnet 5.5 <noreply@anthropic.com>
Claude-Session: https://claude.ai/code/session_01Eskw3wrSdvc2HYQXijyehx
</commit_message>
<xml_diff>
--- a/curriculum/Bilim-Araly-plan-po-klassam.docx
+++ b/curriculum/Bilim-Araly-plan-po-klassam.docx
@@ -762,7 +762,7 @@
                 <w:sz w:val="19"/>
                 <w:szCs w:val="19"/>
               </w:rPr>
-              <w:t xml:space="preserve">Матрица покрытия 1 класса, закрыть дыры. 2 класс: все предметы по приказу (сейчас только математика и естествознание).</w:t>
+              <w:t xml:space="preserve">Закрыть дыры 1 класса (матрица покрытия сделана). 2 класс: все предметы по приказу (сейчас только математика и естествознание).</w:t>
             </w:r>
           </w:p>
         </w:tc>
@@ -2085,7 +2085,7 @@
                 <w:sz w:val="19"/>
                 <w:szCs w:val="19"/>
               </w:rPr>
-              <w:t xml:space="preserve">10 предметов (рус.), 10 предметов (каз.)</w:t>
+              <w:t xml:space="preserve">Рус.: готово 36%, нет 42%. Каз.: только игры</w:t>
             </w:r>
           </w:p>
         </w:tc>
@@ -4231,7 +4231,7 @@
           <w:sz w:val="22"/>
           <w:szCs w:val="22"/>
         </w:rPr>
-        <w:t xml:space="preserve">Сделано: 1 класс (оба направления) — по всем 10 предметам есть страницы, мини-фильмы, игры; в математике 55 страниц и 18 курсов. 2 класс — математика (17 тем) и естествознание (5 тем).</w:t>
+        <w:t xml:space="preserve">Результат сверки 1 класса (русская версия, 276 целей): готово 100 (36%), частично или нужно проверить 59 (21%), нет на сайте 117 (42%). Казахская версия (244 цели): курсов нет, есть только игры — 104 цели «сверить», 139 «нет», 1 готова (сингармонизм).</w:t>
       </w:r>
     </w:p>
     <w:p>
@@ -4249,7 +4249,61 @@
           <w:sz w:val="22"/>
           <w:szCs w:val="22"/>
         </w:rPr>
-        <w:t xml:space="preserve">Не сверено: покрывают ли эти страницы все цели приказа. Для 1 класса это первая работа плана (раздел 5, шаг 1).</w:t>
+        <w:t xml:space="preserve">По предметам 1 класса (рус.): математика — 40 из 51 готово; естествознание — 18 из 31; труд — 10 из 13; ИЗО — 6 из 33 (остальное частично); физкультура — 6 из 19; грамота — 8 из 36; казахский язык — 5 из 24; познание мира — 3 из 35; музыка — 2 из 14; цифровая грамотность — 2 из 20.</w:t>
+      </w:r>
+    </w:p>
+    <w:p>
+      <w:pPr>
+        <w:pStyle w:val="ListParagraph"/>
+        <w:numPr>
+          <w:ilvl w:val="0"/>
+          <w:numId w:val="2"/>
+        </w:numPr>
+        <w:spacing w:after="70" w:line="290"/>
+      </w:pPr>
+      <w:r>
+        <w:rPr>
+          <w:rFonts w:ascii="Arial" w:cs="Arial" w:eastAsia="Arial" w:hAnsi="Arial"/>
+          <w:sz w:val="22"/>
+          <w:szCs w:val="22"/>
+        </w:rPr>
+        <w:t xml:space="preserve">Главные пробелы 1 класса: познание мира (семья, школа, адрес, гигиена, история Казахстана, государственные символы), цифровая грамотность (информация, интернет, графический редактор, алгоритмы), письмо и правописание в грамоте, пение и нотная грамота в музыке, казахский язык (речь, чтение, письмо). Полный список — лист «Дыры 1 класса» в трекере.</w:t>
+      </w:r>
+    </w:p>
+    <w:p>
+      <w:pPr>
+        <w:pStyle w:val="ListParagraph"/>
+        <w:numPr>
+          <w:ilvl w:val="0"/>
+          <w:numId w:val="2"/>
+        </w:numPr>
+        <w:spacing w:after="70" w:line="290"/>
+      </w:pPr>
+      <w:r>
+        <w:rPr>
+          <w:rFonts w:ascii="Arial" w:cs="Arial" w:eastAsia="Arial" w:hAnsi="Arial"/>
+          <w:sz w:val="22"/>
+          <w:szCs w:val="22"/>
+        </w:rPr>
+        <w:t xml:space="preserve">Сверка сделана по названиям страниц, описаниям курсов и целям уроков, не построчным чтением, поэтому «готово» — рабочая оценка. Перед закрытием класса её надо подтвердить выборочным просмотром.</w:t>
+      </w:r>
+    </w:p>
+    <w:p>
+      <w:pPr>
+        <w:pStyle w:val="ListParagraph"/>
+        <w:numPr>
+          <w:ilvl w:val="0"/>
+          <w:numId w:val="2"/>
+        </w:numPr>
+        <w:spacing w:after="70" w:line="290"/>
+      </w:pPr>
+      <w:r>
+        <w:rPr>
+          <w:rFonts w:ascii="Arial" w:cs="Arial" w:eastAsia="Arial" w:hAnsi="Arial"/>
+          <w:sz w:val="22"/>
+          <w:szCs w:val="22"/>
+        </w:rPr>
+        <w:t xml:space="preserve">2 класс: математика (17 тем) и естествознание (5 тем) есть, соответствие целям не сверено.</w:t>
       </w:r>
     </w:p>
     <w:p>
@@ -4654,7 +4708,7 @@
                 <w:sz w:val="19"/>
                 <w:szCs w:val="19"/>
               </w:rPr>
-              <w:t xml:space="preserve">Матрица покрытия 1 класса: привязать страницы к 276 (рус.) и 244 (каз.) целям.</w:t>
+              <w:t xml:space="preserve">Матрица покрытия 1 класса: выполнено 29.10.2026 (лист «Дыры 1 класса» в трекере).</w:t>
             </w:r>
           </w:p>
         </w:tc>
@@ -4718,7 +4772,7 @@
                 <w:sz w:val="19"/>
                 <w:szCs w:val="19"/>
               </w:rPr>
-              <w:t xml:space="preserve">Список дыр 1 класса</w:t>
+              <w:t xml:space="preserve">Список дыр: 117 (рус.), 139 (каз.)</w:t>
             </w:r>
           </w:p>
         </w:tc>
@@ -4790,7 +4844,7 @@
                 <w:sz w:val="19"/>
                 <w:szCs w:val="19"/>
               </w:rPr>
-              <w:t xml:space="preserve">Закрыть дыры 1 класса, затем 2 класс: русский язык, казахский язык, познание мира, цифровая грамотность и остальные предметы.</w:t>
+              <w:t xml:space="preserve">Закрыть дыры 1 класса (сначала познание мира, грамота, казахский язык, цифровая грамотность; в казахской версии — курсы), затем 2 класс: русский язык, казахский язык, познание мира, цифровая грамотность и остальные предметы.</w:t>
             </w:r>
           </w:p>
         </w:tc>
@@ -5963,7 +6017,7 @@
                 <w:sz w:val="19"/>
                 <w:szCs w:val="19"/>
               </w:rPr>
-              <w:t xml:space="preserve">На сайте сейчас</w:t>
+              <w:t xml:space="preserve">На сайте: Г — готово, С — сверить, Н — нет</w:t>
             </w:r>
           </w:p>
         </w:tc>
@@ -6163,7 +6217,22 @@
                 <w:sz w:val="19"/>
                 <w:szCs w:val="19"/>
               </w:rPr>
-              <w:t xml:space="preserve">Есть: рус. и каз. версии (сверить с целями)</w:t>
+              <w:t xml:space="preserve">рус.: Г 40 · С 9 · Н 2</w:t>
+            </w:r>
+          </w:p>
+          <w:p>
+            <w:pPr>
+              <w:spacing w:after="20"/>
+            </w:pPr>
+            <w:r>
+              <w:rPr>
+                <w:rFonts w:ascii="Arial" w:cs="Arial" w:eastAsia="Arial" w:hAnsi="Arial"/>
+                <w:b w:val="false"/>
+                <w:bCs w:val="false"/>
+                <w:sz w:val="19"/>
+                <w:szCs w:val="19"/>
+              </w:rPr>
+              <w:t xml:space="preserve">каз.: Г 0 · С 40 · Н 11</w:t>
             </w:r>
           </w:p>
         </w:tc>
@@ -6369,7 +6438,22 @@
                 <w:sz w:val="19"/>
                 <w:szCs w:val="19"/>
               </w:rPr>
-              <w:t xml:space="preserve">Есть: рус. и каз. версии (сверить с целями)</w:t>
+              <w:t xml:space="preserve">рус.: Г 18 · С 9 · Н 4</w:t>
+            </w:r>
+          </w:p>
+          <w:p>
+            <w:pPr>
+              <w:spacing w:after="20"/>
+            </w:pPr>
+            <w:r>
+              <w:rPr>
+                <w:rFonts w:ascii="Arial" w:cs="Arial" w:eastAsia="Arial" w:hAnsi="Arial"/>
+                <w:b w:val="false"/>
+                <w:bCs w:val="false"/>
+                <w:sz w:val="19"/>
+                <w:szCs w:val="19"/>
+              </w:rPr>
+              <w:t xml:space="preserve">каз.: Г 0 · С 27 · Н 4</w:t>
             </w:r>
           </w:p>
         </w:tc>
@@ -6569,7 +6653,22 @@
                 <w:sz w:val="19"/>
                 <w:szCs w:val="19"/>
               </w:rPr>
-              <w:t xml:space="preserve">Есть: рус. и каз. версии (сверить с целями)</w:t>
+              <w:t xml:space="preserve">рус.: Г 3 · С 4 · Н 28</w:t>
+            </w:r>
+          </w:p>
+          <w:p>
+            <w:pPr>
+              <w:spacing w:after="20"/>
+            </w:pPr>
+            <w:r>
+              <w:rPr>
+                <w:rFonts w:ascii="Arial" w:cs="Arial" w:eastAsia="Arial" w:hAnsi="Arial"/>
+                <w:b w:val="false"/>
+                <w:bCs w:val="false"/>
+                <w:sz w:val="19"/>
+                <w:szCs w:val="19"/>
+              </w:rPr>
+              <w:t xml:space="preserve">каз.: Г 0 · С 6 · Н 29</w:t>
             </w:r>
           </w:p>
         </w:tc>
@@ -6775,7 +6874,22 @@
                 <w:sz w:val="19"/>
                 <w:szCs w:val="19"/>
               </w:rPr>
-              <w:t xml:space="preserve">Есть: рус. и каз. версии (сверить с целями)</w:t>
+              <w:t xml:space="preserve">рус.: Г 2 · С 1 · Н 17</w:t>
+            </w:r>
+          </w:p>
+          <w:p>
+            <w:pPr>
+              <w:spacing w:after="20"/>
+            </w:pPr>
+            <w:r>
+              <w:rPr>
+                <w:rFonts w:ascii="Arial" w:cs="Arial" w:eastAsia="Arial" w:hAnsi="Arial"/>
+                <w:b w:val="false"/>
+                <w:bCs w:val="false"/>
+                <w:sz w:val="19"/>
+                <w:szCs w:val="19"/>
+              </w:rPr>
+              <w:t xml:space="preserve">каз.: Г 0 · С 1 · Н 19</w:t>
             </w:r>
           </w:p>
         </w:tc>
@@ -6975,7 +7089,22 @@
                 <w:sz w:val="19"/>
                 <w:szCs w:val="19"/>
               </w:rPr>
-              <w:t xml:space="preserve">Есть: рус. и каз. версии (сверить с целями)</w:t>
+              <w:t xml:space="preserve">рус.: Г 6 · С 17 · Н 10</w:t>
+            </w:r>
+          </w:p>
+          <w:p>
+            <w:pPr>
+              <w:spacing w:after="20"/>
+            </w:pPr>
+            <w:r>
+              <w:rPr>
+                <w:rFonts w:ascii="Arial" w:cs="Arial" w:eastAsia="Arial" w:hAnsi="Arial"/>
+                <w:b w:val="false"/>
+                <w:bCs w:val="false"/>
+                <w:sz w:val="19"/>
+                <w:szCs w:val="19"/>
+              </w:rPr>
+              <w:t xml:space="preserve">каз.: Г 0 · С 20 · Н 13</w:t>
             </w:r>
           </w:p>
         </w:tc>
@@ -7181,7 +7310,22 @@
                 <w:sz w:val="19"/>
                 <w:szCs w:val="19"/>
               </w:rPr>
-              <w:t xml:space="preserve">Есть: рус. и каз. версии (сверить с целями)</w:t>
+              <w:t xml:space="preserve">рус.: Г 10 · С 3 · Н 0</w:t>
+            </w:r>
+          </w:p>
+          <w:p>
+            <w:pPr>
+              <w:spacing w:after="20"/>
+            </w:pPr>
+            <w:r>
+              <w:rPr>
+                <w:rFonts w:ascii="Arial" w:cs="Arial" w:eastAsia="Arial" w:hAnsi="Arial"/>
+                <w:b w:val="false"/>
+                <w:bCs w:val="false"/>
+                <w:sz w:val="19"/>
+                <w:szCs w:val="19"/>
+              </w:rPr>
+              <w:t xml:space="preserve">каз.: Г 0 · С 2 · Н 11</w:t>
             </w:r>
           </w:p>
         </w:tc>
@@ -7381,7 +7525,22 @@
                 <w:sz w:val="19"/>
                 <w:szCs w:val="19"/>
               </w:rPr>
-              <w:t xml:space="preserve">Есть: рус. и каз. версии (сверить с целями)</w:t>
+              <w:t xml:space="preserve">рус.: Г 2 · С 3 · Н 9</w:t>
+            </w:r>
+          </w:p>
+          <w:p>
+            <w:pPr>
+              <w:spacing w:after="20"/>
+            </w:pPr>
+            <w:r>
+              <w:rPr>
+                <w:rFonts w:ascii="Arial" w:cs="Arial" w:eastAsia="Arial" w:hAnsi="Arial"/>
+                <w:b w:val="false"/>
+                <w:bCs w:val="false"/>
+                <w:sz w:val="19"/>
+                <w:szCs w:val="19"/>
+              </w:rPr>
+              <w:t xml:space="preserve">каз.: Г 0 · С 1 · Н 13</w:t>
             </w:r>
           </w:p>
         </w:tc>
@@ -7587,7 +7746,22 @@
                 <w:sz w:val="19"/>
                 <w:szCs w:val="19"/>
               </w:rPr>
-              <w:t xml:space="preserve">Есть: рус. и каз. версии (сверить с целями)</w:t>
+              <w:t xml:space="preserve">рус.: Г 6 · С 5 · Н 8</w:t>
+            </w:r>
+          </w:p>
+          <w:p>
+            <w:pPr>
+              <w:spacing w:after="20"/>
+            </w:pPr>
+            <w:r>
+              <w:rPr>
+                <w:rFonts w:ascii="Arial" w:cs="Arial" w:eastAsia="Arial" w:hAnsi="Arial"/>
+                <w:b w:val="false"/>
+                <w:bCs w:val="false"/>
+                <w:sz w:val="19"/>
+                <w:szCs w:val="19"/>
+              </w:rPr>
+              <w:t xml:space="preserve">каз.: Г 0 · С 5 · Н 14</w:t>
             </w:r>
           </w:p>
         </w:tc>
@@ -7787,7 +7961,7 @@
                 <w:sz w:val="19"/>
                 <w:szCs w:val="19"/>
               </w:rPr>
-              <w:t xml:space="preserve">Есть: рус. версия (сверить с целями)</w:t>
+              <w:t xml:space="preserve">рус.: Г 8 · С 5 · Н 23</w:t>
             </w:r>
           </w:p>
         </w:tc>
@@ -7993,7 +8167,7 @@
                 <w:sz w:val="19"/>
                 <w:szCs w:val="19"/>
               </w:rPr>
-              <w:t xml:space="preserve">Есть: рус. версия (сверить с целями)</w:t>
+              <w:t xml:space="preserve">рус.: Г 5 · С 3 · Н 16</w:t>
             </w:r>
           </w:p>
         </w:tc>
@@ -8193,7 +8367,7 @@
                 <w:sz w:val="19"/>
                 <w:szCs w:val="19"/>
               </w:rPr>
-              <w:t xml:space="preserve">Есть: каз. версия (сверить с целями)</w:t>
+              <w:t xml:space="preserve">каз.: Г 1 · С 2 · Н 25</w:t>
             </w:r>
           </w:p>
         </w:tc>
@@ -8454,7 +8628,7 @@
                 <w:sz w:val="19"/>
                 <w:szCs w:val="19"/>
               </w:rPr>
-              <w:t xml:space="preserve">На сайте сейчас</w:t>
+              <w:t xml:space="preserve">На сайте: Г — готово, С — сверить, Н — нет</w:t>
             </w:r>
           </w:p>
         </w:tc>
@@ -11557,7 +11731,7 @@
                 <w:sz w:val="19"/>
                 <w:szCs w:val="19"/>
               </w:rPr>
-              <w:t xml:space="preserve">На сайте сейчас</w:t>
+              <w:t xml:space="preserve">На сайте: Г — готово, С — сверить, Н — нет</w:t>
             </w:r>
           </w:p>
         </w:tc>
@@ -14860,7 +15034,7 @@
                 <w:sz w:val="19"/>
                 <w:szCs w:val="19"/>
               </w:rPr>
-              <w:t xml:space="preserve">На сайте сейчас</w:t>
+              <w:t xml:space="preserve">На сайте: Г — готово, С — сверить, Н — нет</w:t>
             </w:r>
           </w:p>
         </w:tc>
@@ -18163,7 +18337,7 @@
                 <w:sz w:val="19"/>
                 <w:szCs w:val="19"/>
               </w:rPr>
-              <w:t xml:space="preserve">На сайте сейчас</w:t>
+              <w:t xml:space="preserve">На сайте: Г — готово, С — сверить, Н — нет</w:t>
             </w:r>
           </w:p>
         </w:tc>
@@ -21466,7 +21640,7 @@
                 <w:sz w:val="19"/>
                 <w:szCs w:val="19"/>
               </w:rPr>
-              <w:t xml:space="preserve">На сайте сейчас</w:t>
+              <w:t xml:space="preserve">На сайте: Г — готово, С — сверить, Н — нет</w:t>
             </w:r>
           </w:p>
         </w:tc>
@@ -24769,7 +24943,7 @@
                 <w:sz w:val="19"/>
                 <w:szCs w:val="19"/>
               </w:rPr>
-              <w:t xml:space="preserve">На сайте сейчас</w:t>
+              <w:t xml:space="preserve">На сайте: Г — готово, С — сверить, Н — нет</w:t>
             </w:r>
           </w:p>
         </w:tc>
@@ -28684,7 +28858,7 @@
                 <w:sz w:val="19"/>
                 <w:szCs w:val="19"/>
               </w:rPr>
-              <w:t xml:space="preserve">На сайте сейчас</w:t>
+              <w:t xml:space="preserve">На сайте: Г — готово, С — сверить, Н — нет</w:t>
             </w:r>
           </w:p>
         </w:tc>
@@ -32599,7 +32773,7 @@
                 <w:sz w:val="19"/>
                 <w:szCs w:val="19"/>
               </w:rPr>
-              <w:t xml:space="preserve">На сайте сейчас</w:t>
+              <w:t xml:space="preserve">На сайте: Г — готово, С — сверить, Н — нет</w:t>
             </w:r>
           </w:p>
         </w:tc>
@@ -36714,7 +36888,7 @@
                 <w:sz w:val="19"/>
                 <w:szCs w:val="19"/>
               </w:rPr>
-              <w:t xml:space="preserve">На сайте сейчас</w:t>
+              <w:t xml:space="preserve">На сайте: Г — готово, С — сверить, Н — нет</w:t>
             </w:r>
           </w:p>
         </w:tc>
@@ -43671,7 +43845,7 @@
                 <w:sz w:val="19"/>
                 <w:szCs w:val="19"/>
               </w:rPr>
-              <w:t xml:space="preserve">На сайте сейчас</w:t>
+              <w:t xml:space="preserve">На сайте: Г — готово, С — сверить, Н — нет</w:t>
             </w:r>
           </w:p>
         </w:tc>

</xml_diff>

<commit_message>
Poznanie mira grade 1: 13 new course lessons (family, school, address, health, nature, history, symbols); tracker updated
Co-Authored-By: Claude Sonnet 5.5 <noreply@anthropic.com>
Claude-Session: https://claude.ai/code/session_01Eskw3wrSdvc2HYQXijyehx
</commit_message>
<xml_diff>
--- a/curriculum/Bilim-Araly-plan-po-klassam.docx
+++ b/curriculum/Bilim-Araly-plan-po-klassam.docx
@@ -2085,7 +2085,7 @@
                 <w:sz w:val="19"/>
                 <w:szCs w:val="19"/>
               </w:rPr>
-              <w:t xml:space="preserve">Рус.: готово 36%, нет 42%. Каз.: только игры</w:t>
+              <w:t xml:space="preserve">Рус.: готово 47%, нет 32%. Каз.: только игры</w:t>
             </w:r>
           </w:p>
         </w:tc>
@@ -4231,7 +4231,7 @@
           <w:sz w:val="22"/>
           <w:szCs w:val="22"/>
         </w:rPr>
-        <w:t xml:space="preserve">Результат сверки 1 класса (русская версия, 276 целей): готово 100 (36%), частично или нужно проверить 59 (21%), нет на сайте 117 (42%). Казахская версия (244 цели): курсов нет, есть только игры — 104 цели «сверить», 139 «нет», 1 готова (сингармонизм).</w:t>
+        <w:t xml:space="preserve">Результат сверки 1 класса (русская версия, 276 целей): готово 130 (47%), частично или нужно проверить 57 (21%), нет на сайте 89 (32%). Казахская версия (244 цели): курсов нет, есть только игры — 104 цели «сверить», 139 «нет», 1 готова (сингармонизм).</w:t>
       </w:r>
     </w:p>
     <w:p>
@@ -4249,7 +4249,7 @@
           <w:sz w:val="22"/>
           <w:szCs w:val="22"/>
         </w:rPr>
-        <w:t xml:space="preserve">По предметам 1 класса (рус.): математика — 40 из 51 готово; естествознание — 18 из 31; труд — 10 из 13; ИЗО — 6 из 33 (остальное частично); физкультура — 6 из 19; грамота — 8 из 36; казахский язык — 5 из 24; познание мира — 3 из 35; музыка — 2 из 14; цифровая грамотность — 2 из 20.</w:t>
+        <w:t xml:space="preserve">По предметам 1 класса (рус.): математика — 40 из 51 готово; естествознание — 18 из 31; труд — 10 из 13; ИЗО — 6 из 33 (остальное частично); физкультура — 6 из 19; грамота — 8 из 36; казахский язык — 5 из 24; познание мира — 33 из 35 (после новых уроков от 29.10.2026); музыка — 2 из 14; цифровая грамотность — 2 из 20.</w:t>
       </w:r>
     </w:p>
     <w:p>
@@ -4267,7 +4267,7 @@
           <w:sz w:val="22"/>
           <w:szCs w:val="22"/>
         </w:rPr>
-        <w:t xml:space="preserve">Главные пробелы 1 класса: познание мира (семья, школа, адрес, гигиена, история Казахстана, государственные символы), цифровая грамотность (информация, интернет, графический редактор, алгоритмы), письмо и правописание в грамоте, пение и нотная грамота в музыке, казахский язык (речь, чтение, письмо). Полный список — лист «Дыры 1 класса» в трекере.</w:t>
+        <w:t xml:space="preserve">Главные пробелы 1 класса: цифровая грамотность (информация, интернет, графический редактор, алгоритмы), письмо и правописание в грамоте, пение и нотная грамота в музыке, казахский язык (речь, чтение, письмо). Полный список — лист «Дыры 1 класса» в трекере.</w:t>
       </w:r>
     </w:p>
     <w:p>
@@ -4772,7 +4772,7 @@
                 <w:sz w:val="19"/>
                 <w:szCs w:val="19"/>
               </w:rPr>
-              <w:t xml:space="preserve">Список дыр: 117 (рус.), 139 (каз.)</w:t>
+              <w:t xml:space="preserve">Список дыр: 89 (рус.), 139 (каз.)</w:t>
             </w:r>
           </w:p>
         </w:tc>
@@ -4844,7 +4844,7 @@
                 <w:sz w:val="19"/>
                 <w:szCs w:val="19"/>
               </w:rPr>
-              <w:t xml:space="preserve">Закрыть дыры 1 класса (сначала познание мира, грамота, казахский язык, цифровая грамотность; в казахской версии — курсы), затем 2 класс: русский язык, казахский язык, познание мира, цифровая грамотность и остальные предметы.</w:t>
+              <w:t xml:space="preserve">Закрыть дыры 1 класса (познание мира закрыто 29.10.2026; дальше грамота, казахский язык, цифровая грамотность, музыка, ИЗО; в казахской версии — курсы), затем 2 класс: русский язык, казахский язык, познание мира, цифровая грамотность и остальные предметы.</w:t>
             </w:r>
           </w:p>
         </w:tc>

</xml_diff>

<commit_message>
Gramota grade 1: 10 new course lessons (listening, etiquette, picture stories, reading, text parts, iotated vowels, soft/hard signs, spelling, word classes, writing); registry and tracker updated
Co-Authored-By: Claude Sonnet 5.5 <noreply@anthropic.com>
Claude-Session: https://claude.ai/code/session_01Eskw3wrSdvc2HYQXijyehx
</commit_message>
<xml_diff>
--- a/curriculum/Bilim-Araly-plan-po-klassam.docx
+++ b/curriculum/Bilim-Araly-plan-po-klassam.docx
@@ -4231,7 +4231,7 @@
           <w:sz w:val="22"/>
           <w:szCs w:val="22"/>
         </w:rPr>
-        <w:t xml:space="preserve">Результат сверки 1 класса (русская версия, 276 целей): готово 130 (47%), частично или нужно проверить 57 (21%), нет на сайте 89 (32%). Казахская версия (244 цели): курсов нет, есть только игры — 104 цели «сверить», 139 «нет», 1 готова (сингармонизм).</w:t>
+        <w:t xml:space="preserve">Результат сверки 1 класса (русская версия, 276 целей): готово 157 (57%), частично или нужно проверить 53 (19%), нет на сайте 66 (24%). Казахская версия (244 цели): курсов нет, есть только игры — 104 цели «сверить», 139 «нет», 1 готова (сингармонизм).</w:t>
       </w:r>
     </w:p>
     <w:p>
@@ -4249,7 +4249,7 @@
           <w:sz w:val="22"/>
           <w:szCs w:val="22"/>
         </w:rPr>
-        <w:t xml:space="preserve">По предметам 1 класса (рус.): математика — 40 из 51 готово; естествознание — 18 из 31; труд — 10 из 13; ИЗО — 6 из 33 (остальное частично); физкультура — 6 из 19; грамота — 8 из 36; казахский язык — 5 из 24; познание мира — 33 из 35 (после новых уроков от 29.10.2026); музыка — 2 из 14; цифровая грамотность — 2 из 20.</w:t>
+        <w:t xml:space="preserve">По предметам 1 класса (рус.): математика — 40 из 51 готово; естествознание — 18 из 31; труд — 10 из 13; ИЗО — 6 из 33 (остальное частично); физкультура — 6 из 19; грамота — 35 из 36 (после новых уроков от 29.10.2026); казахский язык — 5 из 24; познание мира — 33 из 35 (после новых уроков от 29.10.2026); музыка — 2 из 14; цифровая грамотность — 2 из 20.</w:t>
       </w:r>
     </w:p>
     <w:p>
@@ -4267,7 +4267,7 @@
           <w:sz w:val="22"/>
           <w:szCs w:val="22"/>
         </w:rPr>
-        <w:t xml:space="preserve">Главные пробелы 1 класса: цифровая грамотность (информация, интернет, графический редактор, алгоритмы), письмо и правописание в грамоте, пение и нотная грамота в музыке, казахский язык (речь, чтение, письмо). Полный список — лист «Дыры 1 класса» в трекере.</w:t>
+        <w:t xml:space="preserve">Главные пробелы 1 класса: цифровая грамотность (информация, интернет, графический редактор, алгоритмы), пение и нотная грамота в музыке, казахский язык (речь, чтение, письмо). Полный список — лист «Дыры 1 класса» в трекере.</w:t>
       </w:r>
     </w:p>
     <w:p>
@@ -4772,7 +4772,7 @@
                 <w:sz w:val="19"/>
                 <w:szCs w:val="19"/>
               </w:rPr>
-              <w:t xml:space="preserve">Список дыр: 89 (рус.), 139 (каз.)</w:t>
+              <w:t xml:space="preserve">Список дыр: 66 (рус.), 139 (каз.)</w:t>
             </w:r>
           </w:p>
         </w:tc>
@@ -4844,7 +4844,7 @@
                 <w:sz w:val="19"/>
                 <w:szCs w:val="19"/>
               </w:rPr>
-              <w:t xml:space="preserve">Закрыть дыры 1 класса (познание мира закрыто 29.10.2026; дальше грамота, казахский язык, цифровая грамотность, музыка, ИЗО; в казахской версии — курсы), затем 2 класс: русский язык, казахский язык, познание мира, цифровая грамотность и остальные предметы.</w:t>
+              <w:t xml:space="preserve">Закрыть дыры 1 класса (познание мира и грамота закрыты 29.10.2026; дальше цифровая грамотность, казахский язык, музыка, ИЗО; в казахской версии — курсы), затем 2 класс: русский язык, казахский язык, познание мира, цифровая грамотность и остальные предметы.</w:t>
             </w:r>
           </w:p>
         </w:tc>
@@ -6653,7 +6653,7 @@
                 <w:sz w:val="19"/>
                 <w:szCs w:val="19"/>
               </w:rPr>
-              <w:t xml:space="preserve">рус.: Г 3 · С 4 · Н 28</w:t>
+              <w:t xml:space="preserve">рус.: Г 33 · С 2 · Н 0</w:t>
             </w:r>
           </w:p>
           <w:p>
@@ -7961,7 +7961,7 @@
                 <w:sz w:val="19"/>
                 <w:szCs w:val="19"/>
               </w:rPr>
-              <w:t xml:space="preserve">рус.: Г 8 · С 5 · Н 23</w:t>
+              <w:t xml:space="preserve">рус.: Г 35 · С 1 · Н 0</w:t>
             </w:r>
           </w:p>
         </w:tc>

</xml_diff>

<commit_message>
Digital literacy grade 1: 8 new course lessons (information types, forms, transfer, Internet, safety, graphic editor, editing tools, algorithms and robot); registry and tracker updated
Co-Authored-By: Claude Sonnet 5.5 <noreply@anthropic.com>
Claude-Session: https://claude.ai/code/session_01Eskw3wrSdvc2HYQXijyehx
</commit_message>
<xml_diff>
--- a/curriculum/Bilim-Araly-plan-po-klassam.docx
+++ b/curriculum/Bilim-Araly-plan-po-klassam.docx
@@ -4231,7 +4231,7 @@
           <w:sz w:val="22"/>
           <w:szCs w:val="22"/>
         </w:rPr>
-        <w:t xml:space="preserve">Результат сверки 1 класса (русская версия, 276 целей): готово 157 (57%), частично или нужно проверить 53 (19%), нет на сайте 66 (24%). Казахская версия (244 цели): курсов нет, есть только игры — 104 цели «сверить», 139 «нет», 1 готова (сингармонизм).</w:t>
+        <w:t xml:space="preserve">Результат сверки 1 класса (русская версия, 276 целей): готово 175 (63%), частично или нужно проверить 52 (19%), нет на сайте 49 (18%). Казахская версия (244 цели): курсов нет, есть только игры — 104 цели «сверить», 139 «нет», 1 готова (сингармонизм).</w:t>
       </w:r>
     </w:p>
     <w:p>
@@ -4249,7 +4249,7 @@
           <w:sz w:val="22"/>
           <w:szCs w:val="22"/>
         </w:rPr>
-        <w:t xml:space="preserve">По предметам 1 класса (рус.): математика — 40 из 51 готово; естествознание — 18 из 31; труд — 10 из 13; ИЗО — 6 из 33 (остальное частично); физкультура — 6 из 19; грамота — 35 из 36 (после новых уроков от 29.10.2026); казахский язык — 5 из 24; познание мира — 33 из 35 (после новых уроков от 29.10.2026); музыка — 2 из 14; цифровая грамотность — 2 из 20.</w:t>
+        <w:t xml:space="preserve">По предметам 1 класса (рус.): математика — 40 из 51 готово; естествознание — 18 из 31; труд — 10 из 13; ИЗО — 6 из 33 (остальное частично); физкультура — 6 из 19; грамота — 35 из 36 (после новых уроков от 29.10.2026); казахский язык — 5 из 24; познание мира — 33 из 35 (после новых уроков от 29.10.2026); музыка — 2 из 14; цифровая грамотность — 20 из 20 (после новых уроков от 29.10.2026).</w:t>
       </w:r>
     </w:p>
     <w:p>
@@ -4267,7 +4267,7 @@
           <w:sz w:val="22"/>
           <w:szCs w:val="22"/>
         </w:rPr>
-        <w:t xml:space="preserve">Главные пробелы 1 класса: цифровая грамотность (информация, интернет, графический редактор, алгоритмы), пение и нотная грамота в музыке, казахский язык (речь, чтение, письмо). Полный список — лист «Дыры 1 класса» в трекере.</w:t>
+        <w:t xml:space="preserve">Главные пробелы 1 класса: пение и нотная грамота в музыке, казахский язык (речь, чтение, письмо). Полный список — лист «Дыры 1 класса» в трекере.</w:t>
       </w:r>
     </w:p>
     <w:p>
@@ -4772,7 +4772,7 @@
                 <w:sz w:val="19"/>
                 <w:szCs w:val="19"/>
               </w:rPr>
-              <w:t xml:space="preserve">Список дыр: 66 (рус.), 139 (каз.)</w:t>
+              <w:t xml:space="preserve">Список дыр: 49 (рус.), 139 (каз.)</w:t>
             </w:r>
           </w:p>
         </w:tc>
@@ -4844,7 +4844,7 @@
                 <w:sz w:val="19"/>
                 <w:szCs w:val="19"/>
               </w:rPr>
-              <w:t xml:space="preserve">Закрыть дыры 1 класса (познание мира и грамота закрыты 29.10.2026; дальше цифровая грамотность, казахский язык, музыка, ИЗО; в казахской версии — курсы), затем 2 класс: русский язык, казахский язык, познание мира, цифровая грамотность и остальные предметы.</w:t>
+              <w:t xml:space="preserve">Закрыть дыры 1 класса (познание мира, грамота и цифровая грамотность закрыты 29.10.2026; дальше казахский язык, музыка, ИЗО, физкультура; в казахской версии — курсы), затем 2 класс: русский язык, казахский язык, познание мира, цифровая грамотность и остальные предметы.</w:t>
             </w:r>
           </w:p>
         </w:tc>
@@ -6874,7 +6874,7 @@
                 <w:sz w:val="19"/>
                 <w:szCs w:val="19"/>
               </w:rPr>
-              <w:t xml:space="preserve">рус.: Г 2 · С 1 · Н 17</w:t>
+              <w:t xml:space="preserve">рус.: Г 20 · С 0 · Н 0</w:t>
             </w:r>
           </w:p>
           <w:p>

</xml_diff>

<commit_message>
Music grade 1: 8 new course lessons (singing rules and conductor, song structure, genres, mood, terms, notation, ensemble playing, composing); registry and tracker updated
Co-Authored-By: Claude Sonnet 5.5 <noreply@anthropic.com>
Claude-Session: https://claude.ai/code/session_01Eskw3wrSdvc2HYQXijyehx
</commit_message>
<xml_diff>
--- a/curriculum/Bilim-Araly-plan-po-klassam.docx
+++ b/curriculum/Bilim-Araly-plan-po-klassam.docx
@@ -4231,7 +4231,7 @@
           <w:sz w:val="22"/>
           <w:szCs w:val="22"/>
         </w:rPr>
-        <w:t xml:space="preserve">Результат сверки 1 класса (русская версия, 276 целей): готово 175 (63%), частично или нужно проверить 52 (19%), нет на сайте 49 (18%). Казахская версия (244 цели): курсов нет, есть только игры — 104 цели «сверить», 139 «нет», 1 готова (сингармонизм).</w:t>
+        <w:t xml:space="preserve">Результат сверки 1 класса (русская версия, 276 целей): готово 186 (67%), частично или нужно проверить 50 (18%), нет на сайте 40 (15%). Казахская версия (244 цели): курсов нет, есть только игры — 104 цели «сверить», 139 «нет», 1 готова (сингармонизм).</w:t>
       </w:r>
     </w:p>
     <w:p>
@@ -4249,7 +4249,7 @@
           <w:sz w:val="22"/>
           <w:szCs w:val="22"/>
         </w:rPr>
-        <w:t xml:space="preserve">По предметам 1 класса (рус.): математика — 40 из 51 готово; естествознание — 18 из 31; труд — 10 из 13; ИЗО — 6 из 33 (остальное частично); физкультура — 6 из 19; грамота — 35 из 36 (после новых уроков от 29.10.2026); казахский язык — 5 из 24; познание мира — 33 из 35 (после новых уроков от 29.10.2026); музыка — 2 из 14; цифровая грамотность — 20 из 20 (после новых уроков от 29.10.2026).</w:t>
+        <w:t xml:space="preserve">По предметам 1 класса (рус.): математика — 40 из 51 готово; естествознание — 18 из 31; труд — 10 из 13; ИЗО — 6 из 33 (остальное частично); физкультура — 6 из 19; грамота — 35 из 36 (после новых уроков от 29.10.2026); казахский язык — 5 из 24; познание мира — 33 из 35 (после новых уроков от 29.10.2026); музыка — 13 из 14 (после новых уроков от 29.10.2026); цифровая грамотность — 20 из 20 (после новых уроков от 29.10.2026).</w:t>
       </w:r>
     </w:p>
     <w:p>
@@ -4267,7 +4267,7 @@
           <w:sz w:val="22"/>
           <w:szCs w:val="22"/>
         </w:rPr>
-        <w:t xml:space="preserve">Главные пробелы 1 класса: пение и нотная грамота в музыке, казахский язык (речь, чтение, письмо). Полный список — лист «Дыры 1 класса» в трекере.</w:t>
+        <w:t xml:space="preserve">Главные пробелы 1 класса: казахский язык (речь, чтение, письмо), ИЗО, физкультура. В музыке пение и игра на настоящих инструментах остаются за пределами сайта. Полный список — лист «Дыры 1 класса» в трекере.</w:t>
       </w:r>
     </w:p>
     <w:p>
@@ -4772,7 +4772,7 @@
                 <w:sz w:val="19"/>
                 <w:szCs w:val="19"/>
               </w:rPr>
-              <w:t xml:space="preserve">Список дыр: 49 (рус.), 139 (каз.)</w:t>
+              <w:t xml:space="preserve">Список дыр: 40 (рус.), 139 (каз.)</w:t>
             </w:r>
           </w:p>
         </w:tc>
@@ -4844,7 +4844,7 @@
                 <w:sz w:val="19"/>
                 <w:szCs w:val="19"/>
               </w:rPr>
-              <w:t xml:space="preserve">Закрыть дыры 1 класса (познание мира, грамота и цифровая грамотность закрыты 29.10.2026; дальше казахский язык, музыка, ИЗО, физкультура; в казахской версии — курсы), затем 2 класс: русский язык, казахский язык, познание мира, цифровая грамотность и остальные предметы.</w:t>
+              <w:t xml:space="preserve">Закрыть дыры 1 класса (познание мира, грамота, цифровая грамотность и музыка закрыты 29.10.2026; дальше физкультура, ИЗО, казахский язык; в казахской версии — курсы), затем 2 класс: русский язык, казахский язык, познание мира, цифровая грамотность и остальные предметы.</w:t>
             </w:r>
           </w:p>
         </w:tc>
@@ -7525,7 +7525,7 @@
                 <w:sz w:val="19"/>
                 <w:szCs w:val="19"/>
               </w:rPr>
-              <w:t xml:space="preserve">рус.: Г 2 · С 3 · Н 9</w:t>
+              <w:t xml:space="preserve">рус.: Г 13 · С 1 · Н 0</w:t>
             </w:r>
           </w:p>
           <w:p>

</xml_diff>

<commit_message>
Physical education grade 1: 6 new course lessons (movement qualities, skills and difficulties, spaces, goals and plans, roles and creativity, patriotism); registry and tracker updated
Co-Authored-By: Claude Sonnet 5.5 <noreply@anthropic.com>
Claude-Session: https://claude.ai/code/session_01Eskw3wrSdvc2HYQXijyehx
</commit_message>
<xml_diff>
--- a/curriculum/Bilim-Araly-plan-po-klassam.docx
+++ b/curriculum/Bilim-Araly-plan-po-klassam.docx
@@ -4231,7 +4231,7 @@
           <w:sz w:val="22"/>
           <w:szCs w:val="22"/>
         </w:rPr>
-        <w:t xml:space="preserve">Результат сверки 1 класса (русская версия, 276 целей): готово 186 (67%), частично или нужно проверить 50 (18%), нет на сайте 40 (15%). Казахская версия (244 цели): курсов нет, есть только игры — 104 цели «сверить», 139 «нет», 1 готова (сингармонизм).</w:t>
+        <w:t xml:space="preserve">Результат сверки 1 класса (русская версия, 276 целей): готово 199 (72%), частично или нужно проверить 45 (16%), нет на сайте 32 (12%). Казахская версия (244 цели): курсов нет, есть только игры — 104 цели «сверить», 139 «нет», 1 готова (сингармонизм).</w:t>
       </w:r>
     </w:p>
     <w:p>
@@ -4249,7 +4249,7 @@
           <w:sz w:val="22"/>
           <w:szCs w:val="22"/>
         </w:rPr>
-        <w:t xml:space="preserve">По предметам 1 класса (рус.): математика — 40 из 51 готово; естествознание — 18 из 31; труд — 10 из 13; ИЗО — 6 из 33 (остальное частично); физкультура — 6 из 19; грамота — 35 из 36 (после новых уроков от 29.10.2026); казахский язык — 5 из 24; познание мира — 33 из 35 (после новых уроков от 29.10.2026); музыка — 13 из 14 (после новых уроков от 29.10.2026); цифровая грамотность — 20 из 20 (после новых уроков от 29.10.2026).</w:t>
+        <w:t xml:space="preserve">По предметам 1 класса (рус.): математика — 40 из 51 готово; естествознание — 18 из 31; труд — 10 из 13; ИЗО — 6 из 33 (остальное частично); физкультура — 19 из 19 (после новых уроков от 29.10.2026); грамота — 35 из 36 (после новых уроков от 29.10.2026); казахский язык — 5 из 24; познание мира — 33 из 35 (после новых уроков от 29.10.2026); музыка — 13 из 14 (после новых уроков от 29.10.2026); цифровая грамотность — 20 из 20 (после новых уроков от 29.10.2026).</w:t>
       </w:r>
     </w:p>
     <w:p>
@@ -4267,7 +4267,7 @@
           <w:sz w:val="22"/>
           <w:szCs w:val="22"/>
         </w:rPr>
-        <w:t xml:space="preserve">Главные пробелы 1 класса: казахский язык (речь, чтение, письмо), ИЗО, физкультура. В музыке пение и игра на настоящих инструментах остаются за пределами сайта. Полный список — лист «Дыры 1 класса» в трекере.</w:t>
+        <w:t xml:space="preserve">Главные пробелы 1 класса: казахский язык (речь, чтение, письмо) и ИЗО. В музыке пение и игра на настоящих инструментах остаются за пределами сайта. Полный список — лист «Дыры 1 класса» в трекере.</w:t>
       </w:r>
     </w:p>
     <w:p>
@@ -4772,7 +4772,7 @@
                 <w:sz w:val="19"/>
                 <w:szCs w:val="19"/>
               </w:rPr>
-              <w:t xml:space="preserve">Список дыр: 40 (рус.), 139 (каз.)</w:t>
+              <w:t xml:space="preserve">Список дыр: 32 (рус.), 139 (каз.)</w:t>
             </w:r>
           </w:p>
         </w:tc>
@@ -4844,7 +4844,7 @@
                 <w:sz w:val="19"/>
                 <w:szCs w:val="19"/>
               </w:rPr>
-              <w:t xml:space="preserve">Закрыть дыры 1 класса (познание мира, грамота, цифровая грамотность и музыка закрыты 29.10.2026; дальше физкультура, ИЗО, казахский язык; в казахской версии — курсы), затем 2 класс: русский язык, казахский язык, познание мира, цифровая грамотность и остальные предметы.</w:t>
+              <w:t xml:space="preserve">Закрыть дыры 1 класса (познание мира, грамота, цифровая грамотность, музыка и физкультура закрыты 29.10.2026; дальше ИЗО, казахский язык; в казахской версии — курсы), затем 2 класс: русский язык, казахский язык, познание мира, цифровая грамотность и остальные предметы.</w:t>
             </w:r>
           </w:p>
         </w:tc>
@@ -7746,7 +7746,7 @@
                 <w:sz w:val="19"/>
                 <w:szCs w:val="19"/>
               </w:rPr>
-              <w:t xml:space="preserve">рус.: Г 6 · С 5 · Н 8</w:t>
+              <w:t xml:space="preserve">рус.: Г 19 · С 0 · Н 0</w:t>
             </w:r>
           </w:p>
           <w:p>

</xml_diff>